<commit_message>
added new files and folders
</commit_message>
<xml_diff>
--- a/moreawsservices/Amazon Key Management Service Task.docx
+++ b/moreawsservices/Amazon Key Management Service Task.docx
@@ -4,25 +4,34 @@
   <w:body>
     <w:p>
       <w:pPr>
-        <w:rPr>
-          <w:sz w:val="24"/>
-          <w:szCs w:val="24"/>
-        </w:rPr>
-      </w:pPr>
-      <w:r>
-        <w:rPr>
-          <w:sz w:val="24"/>
-          <w:szCs w:val="24"/>
-        </w:rPr>
-        <w:t>Secrets Management</w:t>
-      </w:r>
-      <w:r>
-        <w:rPr>
-          <w:sz w:val="24"/>
-          <w:szCs w:val="24"/>
-        </w:rPr>
-        <w:t xml:space="preserve"> with Amazon Key Management Service.</w:t>
-      </w:r>
+        <w:ind w:firstLine="720"/>
+        <w:rPr>
+          <w:b/>
+          <w:bCs/>
+          <w:sz w:val="24"/>
+          <w:szCs w:val="24"/>
+        </w:rPr>
+      </w:pPr>
+      <w:r>
+        <w:rPr>
+          <w:b/>
+          <w:bCs/>
+          <w:sz w:val="24"/>
+          <w:szCs w:val="24"/>
+        </w:rPr>
+        <w:t>Secrets Management with Amazon Key Management Service.</w:t>
+      </w:r>
+    </w:p>
+    <w:p>
+      <w:pPr>
+        <w:ind w:firstLine="720"/>
+        <w:rPr>
+          <w:b/>
+          <w:bCs/>
+          <w:sz w:val="24"/>
+          <w:szCs w:val="24"/>
+        </w:rPr>
+      </w:pPr>
     </w:p>
     <w:p>
       <w:pPr>
@@ -51,7 +60,7 @@
           <w:sz w:val="24"/>
           <w:szCs w:val="24"/>
         </w:rPr>
-        <w:t>While we work on different services such RDS S3 buckets etc we can use service such as Amazon Key Management Service</w:t>
+        <w:t>AWS Key Management is important because encryption security completely depends on how securely encryption keys are managed. Even if data is encrypted, unauthorized users can access the data if the encryption keys are exposed or poorly controlled. Proper key management helps organizations securely create, store, rotate, and control access to encryption keys while also providing auditing and monitoring capabilities. Services like AWS KMS enable centralized key management, fine-grained access control, automatic key rotation, and secure integration with AWS services such as S3, EBS, RDS, and Lambda. This helps organizations protect sensitive data, meet compliance requirements, and prevent unauthorized access to critical business information.</w:t>
       </w:r>
       <w:r>
         <w:rPr>
@@ -65,21 +74,6 @@
           <w:sz w:val="24"/>
           <w:szCs w:val="24"/>
         </w:rPr>
-        <w:t>(KMS) to store passwords.</w:t>
-      </w:r>
-    </w:p>
-    <w:p>
-      <w:pPr>
-        <w:rPr>
-          <w:sz w:val="24"/>
-          <w:szCs w:val="24"/>
-        </w:rPr>
-      </w:pPr>
-      <w:r>
-        <w:rPr>
-          <w:sz w:val="24"/>
-          <w:szCs w:val="24"/>
-        </w:rPr>
         <w:t>AWS KMS helps encrypt:</w:t>
       </w:r>
     </w:p>
@@ -235,14 +229,7 @@
           <w:sz w:val="24"/>
           <w:szCs w:val="24"/>
         </w:rPr>
-        <w:t>Let’s</w:t>
-      </w:r>
-      <w:r>
-        <w:rPr>
-          <w:sz w:val="24"/>
-          <w:szCs w:val="24"/>
-        </w:rPr>
-        <w:t xml:space="preserve"> do a Hands-On Demo</w:t>
+        <w:t>Let’s do a Hands-On Demo</w:t>
       </w:r>
     </w:p>
     <w:p>
@@ -275,6 +262,7 @@
       </w:pPr>
       <w:r>
         <w:rPr>
+          <w:noProof/>
           <w:sz w:val="24"/>
           <w:szCs w:val="24"/>
         </w:rPr>
@@ -327,9 +315,11 @@
       </w:pPr>
       <w:r>
         <w:rPr>
-          <w:sz w:val="24"/>
-          <w:szCs w:val="24"/>
-        </w:rPr>
+          <w:noProof/>
+          <w:sz w:val="24"/>
+          <w:szCs w:val="24"/>
+        </w:rPr>
+        <w:lastRenderedPageBreak/>
         <w:drawing>
           <wp:inline distT="0" distB="0" distL="0" distR="0" wp14:anchorId="25D0A683" wp14:editId="5090A8D6">
             <wp:extent cx="5731510" cy="1701165"/>
@@ -393,7 +383,6 @@
           <w:sz w:val="24"/>
           <w:szCs w:val="24"/>
         </w:rPr>
-        <w:lastRenderedPageBreak/>
         <w:t>Now create a KMS key</w:t>
       </w:r>
     </w:p>
@@ -427,6 +416,7 @@
       </w:pPr>
       <w:r>
         <w:rPr>
+          <w:noProof/>
           <w:sz w:val="24"/>
           <w:szCs w:val="24"/>
         </w:rPr>
@@ -526,6 +516,7 @@
       </w:pPr>
       <w:r>
         <w:rPr>
+          <w:noProof/>
           <w:sz w:val="24"/>
           <w:szCs w:val="24"/>
         </w:rPr>
@@ -596,9 +587,11 @@
       </w:pPr>
       <w:r>
         <w:rPr>
-          <w:sz w:val="24"/>
-          <w:szCs w:val="24"/>
-        </w:rPr>
+          <w:noProof/>
+          <w:sz w:val="24"/>
+          <w:szCs w:val="24"/>
+        </w:rPr>
+        <w:lastRenderedPageBreak/>
         <w:drawing>
           <wp:inline distT="0" distB="0" distL="0" distR="0" wp14:anchorId="1853878B" wp14:editId="578390CC">
             <wp:extent cx="5731510" cy="2332355"/>
@@ -677,10 +670,10 @@
       </w:pPr>
       <w:r>
         <w:rPr>
-          <w:sz w:val="24"/>
-          <w:szCs w:val="24"/>
-        </w:rPr>
-        <w:lastRenderedPageBreak/>
+          <w:noProof/>
+          <w:sz w:val="24"/>
+          <w:szCs w:val="24"/>
+        </w:rPr>
         <w:drawing>
           <wp:inline distT="0" distB="0" distL="0" distR="0" wp14:anchorId="6D56CFE0" wp14:editId="3671C88D">
             <wp:extent cx="5731510" cy="1120140"/>
@@ -759,6 +752,7 @@
       </w:pPr>
       <w:r>
         <w:rPr>
+          <w:noProof/>
           <w:sz w:val="24"/>
           <w:szCs w:val="24"/>
         </w:rPr>
@@ -840,9 +834,11 @@
       </w:pPr>
       <w:r>
         <w:rPr>
-          <w:sz w:val="24"/>
-          <w:szCs w:val="24"/>
-        </w:rPr>
+          <w:noProof/>
+          <w:sz w:val="24"/>
+          <w:szCs w:val="24"/>
+        </w:rPr>
+        <w:lastRenderedPageBreak/>
         <w:drawing>
           <wp:inline distT="0" distB="0" distL="0" distR="0" wp14:anchorId="6CC24D3C" wp14:editId="7519EE28">
             <wp:extent cx="5731510" cy="2584450"/>
@@ -993,10 +989,10 @@
       </w:pPr>
       <w:r>
         <w:rPr>
-          <w:sz w:val="24"/>
-          <w:szCs w:val="24"/>
-        </w:rPr>
-        <w:lastRenderedPageBreak/>
+          <w:noProof/>
+          <w:sz w:val="24"/>
+          <w:szCs w:val="24"/>
+        </w:rPr>
         <w:drawing>
           <wp:inline distT="0" distB="0" distL="0" distR="0" wp14:anchorId="7ED25C01" wp14:editId="67208CB8">
             <wp:extent cx="5731510" cy="2000885"/>
@@ -1093,9 +1089,11 @@
       </w:pPr>
       <w:r>
         <w:rPr>
-          <w:sz w:val="24"/>
-          <w:szCs w:val="24"/>
-        </w:rPr>
+          <w:noProof/>
+          <w:sz w:val="24"/>
+          <w:szCs w:val="24"/>
+        </w:rPr>
+        <w:lastRenderedPageBreak/>
         <w:drawing>
           <wp:inline distT="0" distB="0" distL="0" distR="0" wp14:anchorId="66C36082" wp14:editId="705A4A1E">
             <wp:extent cx="5731510" cy="2491105"/>
@@ -1145,6 +1143,7 @@
       </w:pPr>
       <w:r>
         <w:rPr>
+          <w:noProof/>
           <w:sz w:val="24"/>
           <w:szCs w:val="24"/>
         </w:rPr>
@@ -1229,7 +1228,6 @@
           <w:sz w:val="24"/>
           <w:szCs w:val="24"/>
         </w:rPr>
-        <w:lastRenderedPageBreak/>
         <w:t xml:space="preserve">Select </w:t>
       </w:r>
       <w:r>
@@ -1259,6 +1257,7 @@
       </w:pPr>
       <w:r>
         <w:rPr>
+          <w:noProof/>
           <w:sz w:val="24"/>
           <w:szCs w:val="24"/>
         </w:rPr>
@@ -1376,6 +1375,7 @@
       </w:pPr>
       <w:r>
         <w:rPr>
+          <w:noProof/>
           <w:sz w:val="24"/>
           <w:szCs w:val="24"/>
         </w:rPr>
@@ -1439,6 +1439,7 @@
       </w:pPr>
       <w:r>
         <w:rPr>
+          <w:noProof/>
           <w:sz w:val="24"/>
           <w:szCs w:val="24"/>
         </w:rPr>
@@ -1520,10 +1521,10 @@
       </w:pPr>
       <w:r>
         <w:rPr>
-          <w:sz w:val="24"/>
-          <w:szCs w:val="24"/>
-        </w:rPr>
-        <w:lastRenderedPageBreak/>
+          <w:noProof/>
+          <w:sz w:val="24"/>
+          <w:szCs w:val="24"/>
+        </w:rPr>
         <w:drawing>
           <wp:inline distT="0" distB="0" distL="0" distR="0" wp14:anchorId="0CC0DE62" wp14:editId="5E201A9C">
             <wp:extent cx="5731510" cy="1410335"/>
@@ -1609,9 +1610,11 @@
       </w:pPr>
       <w:r>
         <w:rPr>
-          <w:sz w:val="24"/>
-          <w:szCs w:val="24"/>
-        </w:rPr>
+          <w:noProof/>
+          <w:sz w:val="24"/>
+          <w:szCs w:val="24"/>
+        </w:rPr>
+        <w:lastRenderedPageBreak/>
         <w:drawing>
           <wp:inline distT="0" distB="0" distL="0" distR="0" wp14:anchorId="10A9B7AE" wp14:editId="59F83BFE">
             <wp:extent cx="5731510" cy="1694180"/>
@@ -1670,13 +1673,96 @@
           <w:szCs w:val="24"/>
         </w:rPr>
       </w:pPr>
-      <w:r>
-        <w:rPr>
+    </w:p>
+    <w:p>
+      <w:pPr>
+        <w:tabs>
+          <w:tab w:val="num" w:pos="720"/>
+        </w:tabs>
+        <w:rPr>
+          <w:sz w:val="24"/>
+          <w:szCs w:val="24"/>
+        </w:rPr>
+      </w:pPr>
+      <w:r>
+        <w:rPr>
+          <w:sz w:val="24"/>
+          <w:szCs w:val="24"/>
+        </w:rPr>
+        <w:t>Let us switch to taha user</w:t>
+      </w:r>
+    </w:p>
+    <w:p>
+      <w:pPr>
+        <w:tabs>
+          <w:tab w:val="num" w:pos="720"/>
+        </w:tabs>
+        <w:rPr>
+          <w:sz w:val="24"/>
+          <w:szCs w:val="24"/>
+        </w:rPr>
+      </w:pPr>
+      <w:r>
+        <w:rPr>
+          <w:noProof/>
           <w:sz w:val="24"/>
           <w:szCs w:val="24"/>
         </w:rPr>
         <w:drawing>
-          <wp:inline distT="0" distB="0" distL="0" distR="0" wp14:anchorId="23225871" wp14:editId="77A7A05E">
+          <wp:inline distT="0" distB="0" distL="0" distR="0" wp14:anchorId="74C034A0" wp14:editId="0CAFCF58">
+            <wp:extent cx="5731510" cy="2268855"/>
+            <wp:effectExtent l="0" t="0" r="2540" b="0"/>
+            <wp:docPr id="222228571" name="Picture 1"/>
+            <wp:cNvGraphicFramePr>
+              <a:graphicFrameLocks xmlns:a="http://schemas.openxmlformats.org/drawingml/2006/main" noChangeAspect="1"/>
+            </wp:cNvGraphicFramePr>
+            <a:graphic xmlns:a="http://schemas.openxmlformats.org/drawingml/2006/main">
+              <a:graphicData uri="http://schemas.openxmlformats.org/drawingml/2006/picture">
+                <pic:pic xmlns:pic="http://schemas.openxmlformats.org/drawingml/2006/picture">
+                  <pic:nvPicPr>
+                    <pic:cNvPr id="222228571" name=""/>
+                    <pic:cNvPicPr/>
+                  </pic:nvPicPr>
+                  <pic:blipFill>
+                    <a:blip r:embed="rId20"/>
+                    <a:stretch>
+                      <a:fillRect/>
+                    </a:stretch>
+                  </pic:blipFill>
+                  <pic:spPr>
+                    <a:xfrm>
+                      <a:off x="0" y="0"/>
+                      <a:ext cx="5731510" cy="2268855"/>
+                    </a:xfrm>
+                    <a:prstGeom prst="rect">
+                      <a:avLst/>
+                    </a:prstGeom>
+                  </pic:spPr>
+                </pic:pic>
+              </a:graphicData>
+            </a:graphic>
+          </wp:inline>
+        </w:drawing>
+      </w:r>
+    </w:p>
+    <w:p>
+      <w:pPr>
+        <w:tabs>
+          <w:tab w:val="num" w:pos="720"/>
+        </w:tabs>
+        <w:rPr>
+          <w:sz w:val="24"/>
+          <w:szCs w:val="24"/>
+        </w:rPr>
+      </w:pPr>
+      <w:r>
+        <w:rPr>
+          <w:noProof/>
+          <w:sz w:val="24"/>
+          <w:szCs w:val="24"/>
+        </w:rPr>
+        <w:drawing>
+          <wp:inline distT="0" distB="0" distL="0" distR="0" wp14:anchorId="7CFF3085" wp14:editId="64F56BA1">
             <wp:extent cx="5731510" cy="1968500"/>
             <wp:effectExtent l="0" t="0" r="2540" b="0"/>
             <wp:docPr id="1752368525" name="Picture 1"/>
@@ -1691,7 +1777,7 @@
                     <pic:cNvPicPr/>
                   </pic:nvPicPr>
                   <pic:blipFill>
-                    <a:blip r:embed="rId20"/>
+                    <a:blip r:embed="rId21"/>
                     <a:stretch>
                       <a:fillRect/>
                     </a:stretch>
@@ -1795,120 +1881,6 @@
           <w:szCs w:val="24"/>
         </w:rPr>
       </w:pPr>
-    </w:p>
-    <w:p>
-      <w:pPr>
-        <w:tabs>
-          <w:tab w:val="num" w:pos="720"/>
-        </w:tabs>
-        <w:rPr>
-          <w:sz w:val="24"/>
-          <w:szCs w:val="24"/>
-        </w:rPr>
-      </w:pPr>
-    </w:p>
-    <w:p>
-      <w:pPr>
-        <w:tabs>
-          <w:tab w:val="num" w:pos="720"/>
-        </w:tabs>
-        <w:rPr>
-          <w:sz w:val="24"/>
-          <w:szCs w:val="24"/>
-        </w:rPr>
-      </w:pPr>
-    </w:p>
-    <w:p>
-      <w:pPr>
-        <w:tabs>
-          <w:tab w:val="num" w:pos="720"/>
-        </w:tabs>
-        <w:rPr>
-          <w:sz w:val="24"/>
-          <w:szCs w:val="24"/>
-        </w:rPr>
-      </w:pPr>
-      <w:r>
-        <w:rPr>
-          <w:sz w:val="24"/>
-          <w:szCs w:val="24"/>
-        </w:rPr>
-        <w:t>Let us switch to taha user</w:t>
-      </w:r>
-    </w:p>
-    <w:p>
-      <w:pPr>
-        <w:tabs>
-          <w:tab w:val="num" w:pos="720"/>
-        </w:tabs>
-        <w:rPr>
-          <w:sz w:val="24"/>
-          <w:szCs w:val="24"/>
-        </w:rPr>
-      </w:pPr>
-      <w:r>
-        <w:rPr>
-          <w:sz w:val="24"/>
-          <w:szCs w:val="24"/>
-        </w:rPr>
-        <w:drawing>
-          <wp:inline distT="0" distB="0" distL="0" distR="0" wp14:anchorId="74C034A0" wp14:editId="0CAFCF58">
-            <wp:extent cx="5731510" cy="2268855"/>
-            <wp:effectExtent l="0" t="0" r="2540" b="0"/>
-            <wp:docPr id="222228571" name="Picture 1"/>
-            <wp:cNvGraphicFramePr>
-              <a:graphicFrameLocks xmlns:a="http://schemas.openxmlformats.org/drawingml/2006/main" noChangeAspect="1"/>
-            </wp:cNvGraphicFramePr>
-            <a:graphic xmlns:a="http://schemas.openxmlformats.org/drawingml/2006/main">
-              <a:graphicData uri="http://schemas.openxmlformats.org/drawingml/2006/picture">
-                <pic:pic xmlns:pic="http://schemas.openxmlformats.org/drawingml/2006/picture">
-                  <pic:nvPicPr>
-                    <pic:cNvPr id="222228571" name=""/>
-                    <pic:cNvPicPr/>
-                  </pic:nvPicPr>
-                  <pic:blipFill>
-                    <a:blip r:embed="rId21"/>
-                    <a:stretch>
-                      <a:fillRect/>
-                    </a:stretch>
-                  </pic:blipFill>
-                  <pic:spPr>
-                    <a:xfrm>
-                      <a:off x="0" y="0"/>
-                      <a:ext cx="5731510" cy="2268855"/>
-                    </a:xfrm>
-                    <a:prstGeom prst="rect">
-                      <a:avLst/>
-                    </a:prstGeom>
-                  </pic:spPr>
-                </pic:pic>
-              </a:graphicData>
-            </a:graphic>
-          </wp:inline>
-        </w:drawing>
-      </w:r>
-    </w:p>
-    <w:p>
-      <w:pPr>
-        <w:tabs>
-          <w:tab w:val="num" w:pos="720"/>
-        </w:tabs>
-        <w:rPr>
-          <w:sz w:val="24"/>
-          <w:szCs w:val="24"/>
-        </w:rPr>
-      </w:pPr>
-    </w:p>
-    <w:p>
-      <w:pPr>
-        <w:tabs>
-          <w:tab w:val="num" w:pos="720"/>
-        </w:tabs>
-        <w:rPr>
-          <w:sz w:val="24"/>
-          <w:szCs w:val="24"/>
-        </w:rPr>
-      </w:pPr>
       <w:r>
         <w:rPr>
           <w:sz w:val="24"/>
@@ -1929,6 +1901,7 @@
       </w:pPr>
       <w:r>
         <w:rPr>
+          <w:noProof/>
           <w:sz w:val="24"/>
           <w:szCs w:val="24"/>
         </w:rPr>
@@ -2769,7 +2742,6 @@
   <w:style w:type="character" w:default="1" w:styleId="DefaultParagraphFont">
     <w:name w:val="Default Paragraph Font"/>
     <w:uiPriority w:val="1"/>
-    <w:semiHidden/>
     <w:unhideWhenUsed/>
   </w:style>
   <w:style w:type="table" w:default="1" w:styleId="TableNormal">

</xml_diff>